<commit_message>
feat(documents): per-vendor branded PDF/Excel/Word (logos, brand colours, template variants); seed passes category-accurate brand; 302/302 parse-back intact
</commit_message>
<xml_diff>
--- a/public/seed/catalyst-creative-agency/catalyst-creative-agency-contract.docx
+++ b/public/seed/catalyst-creative-agency/catalyst-creative-agency-contract.docx
@@ -4,6 +4,57 @@
   <w:body>
     <w:p>
       <w:pPr>
+        <w:pStyle w:val="Heading3"/>
+        <w:shd w:fill="BE185D" w:color="auto" w:val="clear"/>
+        <w:spacing w:after="60"/>
+        <w:jc w:val="center"/>
+      </w:pPr>
+      <w:r>
+        <w:rPr>
+          <w:b/>
+          <w:bCs/>
+          <w:color w:val="FFFFFF"/>
+          <w:sz w:val="30"/>
+          <w:szCs w:val="30"/>
+        </w:rPr>
+        <w:t xml:space="preserve"> CC </w:t>
+      </w:r>
+    </w:p>
+    <w:p>
+      <w:pPr>
+        <w:pStyle w:val="Heading2"/>
+        <w:spacing w:after="40"/>
+        <w:jc w:val="center"/>
+      </w:pPr>
+      <w:r>
+        <w:rPr>
+          <w:b/>
+          <w:bCs/>
+          <w:color w:val="BE185D"/>
+          <w:sz w:val="32"/>
+          <w:szCs w:val="32"/>
+        </w:rPr>
+        <w:t xml:space="preserve">Catalyst Creative Agency</w:t>
+      </w:r>
+    </w:p>
+    <w:p>
+      <w:pPr>
+        <w:pStyle w:val="Heading5"/>
+        <w:pBdr>
+          <w:bottom w:val="single" w:color="BE185D" w:sz="18" w:space="1"/>
+        </w:pBdr>
+        <w:spacing w:after="120" w:before="20"/>
+      </w:pPr>
+      <w:r>
+        <w:rPr>
+          <w:sz w:val="2"/>
+          <w:szCs w:val="2"/>
+        </w:rPr>
+        <w:t xml:space="preserve"/>
+      </w:r>
+    </w:p>
+    <w:p>
+      <w:pPr>
         <w:pStyle w:val="Heading1"/>
       </w:pPr>
       <w:r>
@@ -12,11 +63,21 @@
     </w:p>
     <w:p>
       <w:r>
+        <w:rPr>
+          <w:vanish/>
+          <w:sz w:val="2"/>
+          <w:szCs w:val="2"/>
+        </w:rPr>
         <w:t xml:space="preserve">[[DOCTYPE: contract]]</w:t>
       </w:r>
     </w:p>
     <w:p>
       <w:r>
+        <w:rPr>
+          <w:vanish/>
+          <w:sz w:val="2"/>
+          <w:szCs w:val="2"/>
+        </w:rPr>
         <w:t xml:space="preserve">[[VENDOR: Catalyst Creative Agency]]</w:t>
       </w:r>
     </w:p>
@@ -130,6 +191,11 @@
         <w:pStyle w:val="Heading2"/>
       </w:pPr>
       <w:r>
+        <w:rPr>
+          <w:b/>
+          <w:bCs/>
+          <w:color w:val="BE185D"/>
+        </w:rPr>
         <w:t xml:space="preserve">1. Term and Renewal</w:t>
       </w:r>
     </w:p>
@@ -143,6 +209,11 @@
         <w:pStyle w:val="Heading2"/>
       </w:pPr>
       <w:r>
+        <w:rPr>
+          <w:b/>
+          <w:bCs/>
+          <w:color w:val="BE185D"/>
+        </w:rPr>
         <w:t xml:space="preserve">2. Fees and Payment</w:t>
       </w:r>
     </w:p>
@@ -156,6 +227,11 @@
         <w:pStyle w:val="Heading2"/>
       </w:pPr>
       <w:r>
+        <w:rPr>
+          <w:b/>
+          <w:bCs/>
+          <w:color w:val="BE185D"/>
+        </w:rPr>
         <w:t xml:space="preserve">5. Audit Rights</w:t>
       </w:r>
     </w:p>
@@ -169,12 +245,35 @@
         <w:pStyle w:val="Heading2"/>
       </w:pPr>
       <w:r>
+        <w:rPr>
+          <w:b/>
+          <w:bCs/>
+          <w:color w:val="BE185D"/>
+        </w:rPr>
         <w:t xml:space="preserve">6. Governing Law</w:t>
       </w:r>
     </w:p>
     <w:p>
       <w:r>
         <w:t xml:space="preserve">This Agreement is governed by the laws of Ohio, without regard to its conflict-of-laws principles.</w:t>
+      </w:r>
+    </w:p>
+    <w:p>
+      <w:pPr>
+        <w:pStyle w:val="Heading6"/>
+        <w:pBdr>
+          <w:top w:val="single" w:color="BE185D" w:sz="6" w:space="6"/>
+        </w:pBdr>
+        <w:spacing w:before="200"/>
+        <w:jc w:val="center"/>
+      </w:pPr>
+      <w:r>
+        <w:rPr>
+          <w:color w:val="BE185D"/>
+          <w:sz w:val="16"/>
+          <w:szCs w:val="16"/>
+        </w:rPr>
+        <w:t xml:space="preserve">Catalyst Creative Agency  •  Remit payment per the terms above  •  Thank you for your business</w:t>
       </w:r>
     </w:p>
     <w:sectPr>

</xml_diff>